<commit_message>
Tribune Dutreil v4 : re-ciblage La Tribune et mise en conformité 787 B
Version courte renommée pour La Tribune (Les Échos écartés) ; suppression des
tournures exhortatives ; proposition de ciblage alignée sur l'article 787 B en
vigueur (exclusion somptuaire acquise, extension proposée à la trésorerie de
placement et à l'immobilier de rapport) ; attribution législative neutralisée.

Co-Authored-By: Claude Fable 5 <noreply@anthropic.com>
Claude-Session: https://claude.ai/code/session_01EismpbntstLAG4woJnWJbX
</commit_message>
<xml_diff>
--- a/livrables/Tribune-Dutreil-Carrez/Tribune-Dutreil_Version-Le-Monde_5000-signes.docx
+++ b/livrables/Tribune-Dutreil-Carrez/Tribune-Dutreil_Version-Le-Monde_5000-signes.docx
@@ -132,7 +132,7 @@
           <w:sz w:val="24"/>
           <w:szCs w:val="24"/>
         </w:rPr>
-        <w:t xml:space="preserve">L'ordre de grandeur mérite d'être posé. Pour une entreprise valorisée vingt millions d'euros et un enfant repreneur, les droits sans pacte atteignent de l'ordre de huit millions d'euros. Avec un pacte, autour de deux. Personne n'a huit millions sur un compte courant. On emprunte, on ponctionne la trésorerie de l'entreprise, ou on vend. Le régime existe pour fermer cette impasse, en échange d'années de conservation des titres et de direction effective. La loi de finances pour 2026 vient d'ailleurs de durcir l'exercice, engagement porté à huit ans au minimum et exclusion des actifs étrangers à l'exploitation. Ces règles ont trois mois. Qu'on les laisse produire leurs effets, et qu'on les mesure, avant d'en écrire de nouvelles.</w:t>
+        <w:t xml:space="preserve">L'ordre de grandeur mérite d'être posé. Pour une entreprise valorisée vingt millions d'euros et un enfant repreneur, les droits sans pacte atteignent de l'ordre de huit millions d'euros. Avec un pacte, autour de deux. Personne n'a huit millions sur un compte courant. On emprunte, on ponctionne la trésorerie de l'entreprise, ou on vend. Le régime existe pour fermer cette impasse, en échange d'années de conservation des titres et de direction effective. Le législateur vient d'ailleurs de durcir l'exercice, engagement porté à huit ans au total et exclusion de l'assiette des résidences, yachts, œuvres d'art et autres biens de confort logés dans les sociétés. Ces règles ont quelques mois. Personne n'en a mesuré les effets. En écrire de nouvelles dès cet automne, c'est légiférer à l'aveugle.</w:t>
       </w:r>
     </w:p>
     <w:p>
@@ -227,7 +227,7 @@
           <w:sz w:val="24"/>
           <w:szCs w:val="24"/>
         </w:rPr>
-        <w:t xml:space="preserve">D'abord ce que les fiscalistes appellent une clause de grand-père. Les règles en vigueur au jour de la signature valent jusqu'au terme du pacte, pour tous les pactes en cours. C'est la contrepartie loyale d'un engagement de huit ans, et son coût budgétaire est nul. Ensuite un principe simple, 75/0. L'exonération pleine, sans plafond, pour l'entreprise réellement transmise et dirigée, au besoin assortie d'engagements sur l'emploi. Rien pour la trésorerie de placement ni l'immobilier de confort. Ce ciblage rapporterait davantage qu'une baisse de taux, et il répond à la question d'équité par la structure même du régime. Enfin une évaluation publique et indépendante tous les trois ans, seule occasion de retoucher le dispositif. La matière statistique existe, le travail de la Cour et de l'Institut des politiques publiques vient de le montrer. Il manque le rendez-vous.</w:t>
+        <w:t xml:space="preserve">D'abord ce que les fiscalistes appellent une clause de grand-père. Les règles en vigueur au jour de la signature valent jusqu'au terme du pacte, pour tous les pactes en cours. C'est la contrepartie loyale d'un engagement de huit ans, et son coût budgétaire est nul. Ensuite, achever le ciblage. La loi écarte désormais de l'exonération les résidences, les yachts ou les œuvres d'art logés dans les sociétés. Elle ne dit toujours rien de la trésorerie de placement ni de l'immobilier de rapport. Le même mécanisme, étendu à ces actifs, donnerait au régime sa forme aboutie, 75 % sans plafond pour l'outil professionnel réellement transmis et dirigé, au besoin assorti d'engagements sur l'emploi, rien pour le reste. Ce ciblage rapporterait davantage qu'une baisse de taux, et il répond à la question d'équité par la structure même du régime. Enfin une évaluation publique et indépendante tous les trois ans, seule occasion de retoucher le dispositif. La matière statistique existe, le travail de la Cour et de l'Institut des politiques publiques vient de le montrer. Il manque le rendez-vous.</w:t>
       </w:r>
     </w:p>
     <w:p>

</xml_diff>